<commit_message>
Added additional documentation details.
</commit_message>
<xml_diff>
--- a/Docs/Fleetrock Alvys Business Central Integration - Setup.docx
+++ b/Docs/Fleetrock Alvys Business Central Integration - Setup.docx
@@ -277,6 +277,9 @@
     </w:p>
     <w:p>
       <w:r>
+        <w:rPr>
+          <w:noProof/>
+        </w:rPr>
         <w:lastRenderedPageBreak/>
         <w:drawing>
           <wp:inline distT="0" distB="0" distL="0" distR="0" wp14:anchorId="1337E9D3" wp14:editId="0E943282">
@@ -595,6 +598,9 @@
     </w:p>
     <w:p>
       <w:r>
+        <w:rPr>
+          <w:noProof/>
+        </w:rPr>
         <w:drawing>
           <wp:inline distT="0" distB="0" distL="0" distR="0" wp14:anchorId="52EDD0B9" wp14:editId="086D19D5">
             <wp:extent cx="4915586" cy="1857634"/>
@@ -750,6 +756,9 @@
     </w:p>
     <w:p>
       <w:r>
+        <w:rPr>
+          <w:noProof/>
+        </w:rPr>
         <w:drawing>
           <wp:inline distT="0" distB="0" distL="0" distR="0" wp14:anchorId="1238F497" wp14:editId="6C623D92">
             <wp:extent cx="5943600" cy="932180"/>
@@ -887,6 +896,9 @@
     </w:p>
     <w:p>
       <w:r>
+        <w:rPr>
+          <w:noProof/>
+        </w:rPr>
         <w:drawing>
           <wp:inline distT="0" distB="0" distL="0" distR="0" wp14:anchorId="294DE353" wp14:editId="2C169ED3">
             <wp:extent cx="4858428" cy="1724266"/>
@@ -938,13 +950,7 @@
     </w:p>
     <w:p>
       <w:r>
-        <w:t xml:space="preserve">When a Repair Order is invoiced, it will automatically be imported as a Sales Invoice in Business Central via the Job Queue. If the </w:t>
-      </w:r>
-      <w:r>
-        <w:t>Auto-Post Repair Orders</w:t>
-      </w:r>
-      <w:r>
-        <w:t xml:space="preserve"> field on the </w:t>
+        <w:t xml:space="preserve">When a Repair Order is invoiced, it will automatically be imported as a Sales Invoice in Business Central via the Job Queue. If the Auto-Post Repair Orders field on the </w:t>
       </w:r>
       <w:proofErr w:type="spellStart"/>
       <w:r>
@@ -1147,6 +1153,9 @@
     </w:p>
     <w:p>
       <w:r>
+        <w:rPr>
+          <w:noProof/>
+        </w:rPr>
         <w:lastRenderedPageBreak/>
         <w:drawing>
           <wp:inline distT="0" distB="0" distL="0" distR="0" wp14:anchorId="750DAEA5" wp14:editId="28F1E475">
@@ -1195,6 +1204,9 @@
     </w:p>
     <w:p>
       <w:r>
+        <w:rPr>
+          <w:noProof/>
+        </w:rPr>
         <w:drawing>
           <wp:inline distT="0" distB="0" distL="0" distR="0" wp14:anchorId="3CA5660F" wp14:editId="304915E8">
             <wp:extent cx="4896533" cy="2162477"/>
@@ -1234,7 +1246,16 @@
     </w:p>
     <w:p>
       <w:r>
-        <w:t>Populate the Driver Dimension with the proper Dimension value, if using Dimensions for Drivers.</w:t>
+        <w:t xml:space="preserve">Populate the Driver Dimension with the </w:t>
+      </w:r>
+      <w:r>
+        <w:t>related</w:t>
+      </w:r>
+      <w:r>
+        <w:t xml:space="preserve"> Dimension </w:t>
+      </w:r>
+      <w:r>
+        <w:t>in Business Central for Drivers</w:t>
       </w:r>
     </w:p>
     <w:p>
@@ -1488,6 +1509,7 @@
         <w:t xml:space="preserve"> whenever a Sales Invoice is posted</w:t>
       </w:r>
     </w:p>
+    <w:p/>
     <w:sectPr>
       <w:pgSz w:w="12240" w:h="15840"/>
       <w:pgMar w:top="1440" w:right="1440" w:bottom="1440" w:left="1440" w:header="720" w:footer="720" w:gutter="0"/>

</xml_diff>